<commit_message>
add ARP check and preamble
</commit_message>
<xml_diff>
--- a/ARP/תמונות לקוד ARP.docx
+++ b/ARP/תמונות לקוד ARP.docx
@@ -11,29 +11,22 @@
       <w:r>
         <w:rPr>
           <w:rFonts w:cs="Arial"/>
+          <w:noProof/>
           <w:rtl/>
         </w:rPr>
         <w:drawing>
-          <wp:anchor distT="0" distB="0" distL="114300" distR="114300" simplePos="0" relativeHeight="251658240" behindDoc="1" locked="0" layoutInCell="1" allowOverlap="1" wp14:anchorId="4DEDE7C3" wp14:editId="7DF2E0C4">
+          <wp:anchor distT="0" distB="0" distL="114300" distR="114300" simplePos="0" relativeHeight="251662336" behindDoc="1" locked="0" layoutInCell="1" allowOverlap="1" wp14:anchorId="392A334A" wp14:editId="27ED9C7F">
             <wp:simplePos x="0" y="0"/>
             <wp:positionH relativeFrom="page">
-              <wp:align>right</wp:align>
+              <wp:posOffset>-208832</wp:posOffset>
             </wp:positionH>
             <wp:positionV relativeFrom="paragraph">
-              <wp:posOffset>251460</wp:posOffset>
+              <wp:posOffset>327660</wp:posOffset>
             </wp:positionV>
-            <wp:extent cx="7552690" cy="3020695"/>
-            <wp:effectExtent l="0" t="0" r="0" b="8255"/>
-            <wp:wrapTight wrapText="bothSides">
-              <wp:wrapPolygon edited="0">
-                <wp:start x="0" y="0"/>
-                <wp:lineTo x="0" y="21523"/>
-                <wp:lineTo x="21520" y="21523"/>
-                <wp:lineTo x="21520" y="0"/>
-                <wp:lineTo x="0" y="0"/>
-              </wp:wrapPolygon>
-            </wp:wrapTight>
-            <wp:docPr id="1599756628" name="תמונה 1"/>
+            <wp:extent cx="7769142" cy="2651760"/>
+            <wp:effectExtent l="0" t="0" r="3810" b="0"/>
+            <wp:wrapNone/>
+            <wp:docPr id="2118385777" name="תמונה 1"/>
             <wp:cNvGraphicFramePr>
               <a:graphicFrameLocks xmlns:a="http://schemas.openxmlformats.org/drawingml/2006/main" noChangeAspect="1"/>
             </wp:cNvGraphicFramePr>
@@ -41,7 +34,7 @@
               <a:graphicData uri="http://schemas.openxmlformats.org/drawingml/2006/picture">
                 <pic:pic xmlns:pic="http://schemas.openxmlformats.org/drawingml/2006/picture">
                   <pic:nvPicPr>
-                    <pic:cNvPr id="1599756628" name=""/>
+                    <pic:cNvPr id="2118385777" name=""/>
                     <pic:cNvPicPr/>
                   </pic:nvPicPr>
                   <pic:blipFill>
@@ -59,7 +52,7 @@
                   <pic:spPr>
                     <a:xfrm>
                       <a:off x="0" y="0"/>
-                      <a:ext cx="7552690" cy="3020695"/>
+                      <a:ext cx="7774763" cy="2653679"/>
                     </a:xfrm>
                     <a:prstGeom prst="rect">
                       <a:avLst/>
@@ -95,26 +88,18 @@
           <w:rtl/>
         </w:rPr>
         <w:drawing>
-          <wp:anchor distT="0" distB="0" distL="114300" distR="114300" simplePos="0" relativeHeight="251660288" behindDoc="1" locked="0" layoutInCell="1" allowOverlap="1" wp14:anchorId="45A19380" wp14:editId="59A926AA">
+          <wp:anchor distT="0" distB="0" distL="114300" distR="114300" simplePos="0" relativeHeight="251663360" behindDoc="1" locked="0" layoutInCell="1" allowOverlap="1" wp14:anchorId="478DAD69" wp14:editId="3BECE1BD">
             <wp:simplePos x="0" y="0"/>
-            <wp:positionH relativeFrom="page">
-              <wp:posOffset>1521943</wp:posOffset>
+            <wp:positionH relativeFrom="column">
+              <wp:posOffset>-1389256</wp:posOffset>
             </wp:positionH>
             <wp:positionV relativeFrom="paragraph">
-              <wp:posOffset>6295390</wp:posOffset>
+              <wp:posOffset>6167755</wp:posOffset>
             </wp:positionV>
-            <wp:extent cx="6032652" cy="2247900"/>
-            <wp:effectExtent l="0" t="0" r="6350" b="0"/>
-            <wp:wrapTight wrapText="bothSides">
-              <wp:wrapPolygon edited="0">
-                <wp:start x="0" y="0"/>
-                <wp:lineTo x="0" y="21417"/>
-                <wp:lineTo x="21555" y="21417"/>
-                <wp:lineTo x="21555" y="0"/>
-                <wp:lineTo x="0" y="0"/>
-              </wp:wrapPolygon>
-            </wp:wrapTight>
-            <wp:docPr id="960341191" name="תמונה 1"/>
+            <wp:extent cx="7859906" cy="2613660"/>
+            <wp:effectExtent l="0" t="0" r="8255" b="0"/>
+            <wp:wrapNone/>
+            <wp:docPr id="492761728" name="תמונה 1"/>
             <wp:cNvGraphicFramePr>
               <a:graphicFrameLocks xmlns:a="http://schemas.openxmlformats.org/drawingml/2006/main" noChangeAspect="1"/>
             </wp:cNvGraphicFramePr>
@@ -122,7 +107,7 @@
               <a:graphicData uri="http://schemas.openxmlformats.org/drawingml/2006/picture">
                 <pic:pic xmlns:pic="http://schemas.openxmlformats.org/drawingml/2006/picture">
                   <pic:nvPicPr>
-                    <pic:cNvPr id="960341191" name=""/>
+                    <pic:cNvPr id="492761728" name=""/>
                     <pic:cNvPicPr/>
                   </pic:nvPicPr>
                   <pic:blipFill>
@@ -140,7 +125,7 @@
                   <pic:spPr>
                     <a:xfrm>
                       <a:off x="0" y="0"/>
-                      <a:ext cx="6035443" cy="2248940"/>
+                      <a:ext cx="7878498" cy="2619842"/>
                     </a:xfrm>
                     <a:prstGeom prst="rect">
                       <a:avLst/>
@@ -161,29 +146,22 @@
       <w:r>
         <w:rPr>
           <w:rFonts w:cs="Arial"/>
+          <w:noProof/>
           <w:rtl/>
         </w:rPr>
         <w:drawing>
-          <wp:anchor distT="0" distB="0" distL="114300" distR="114300" simplePos="0" relativeHeight="251659264" behindDoc="1" locked="0" layoutInCell="1" allowOverlap="1" wp14:anchorId="18B56B2C" wp14:editId="772D43D8">
+          <wp:anchor distT="0" distB="0" distL="114300" distR="114300" simplePos="0" relativeHeight="251661312" behindDoc="1" locked="0" layoutInCell="1" allowOverlap="1" wp14:anchorId="6A3DD3D6" wp14:editId="5F7A578C">
             <wp:simplePos x="0" y="0"/>
             <wp:positionH relativeFrom="page">
               <wp:align>right</wp:align>
             </wp:positionH>
             <wp:positionV relativeFrom="paragraph">
-              <wp:posOffset>2981960</wp:posOffset>
+              <wp:posOffset>2708275</wp:posOffset>
             </wp:positionV>
-            <wp:extent cx="4479925" cy="3369945"/>
-            <wp:effectExtent l="0" t="0" r="0" b="1905"/>
-            <wp:wrapTight wrapText="bothSides">
-              <wp:wrapPolygon edited="0">
-                <wp:start x="0" y="0"/>
-                <wp:lineTo x="0" y="21490"/>
-                <wp:lineTo x="21493" y="21490"/>
-                <wp:lineTo x="21493" y="0"/>
-                <wp:lineTo x="0" y="0"/>
-              </wp:wrapPolygon>
-            </wp:wrapTight>
-            <wp:docPr id="1586993040" name="תמונה 1"/>
+            <wp:extent cx="4133741" cy="3398520"/>
+            <wp:effectExtent l="0" t="0" r="635" b="0"/>
+            <wp:wrapNone/>
+            <wp:docPr id="1711248338" name="תמונה 1"/>
             <wp:cNvGraphicFramePr>
               <a:graphicFrameLocks xmlns:a="http://schemas.openxmlformats.org/drawingml/2006/main" noChangeAspect="1"/>
             </wp:cNvGraphicFramePr>
@@ -191,7 +169,7 @@
               <a:graphicData uri="http://schemas.openxmlformats.org/drawingml/2006/picture">
                 <pic:pic xmlns:pic="http://schemas.openxmlformats.org/drawingml/2006/picture">
                   <pic:nvPicPr>
-                    <pic:cNvPr id="1586993040" name=""/>
+                    <pic:cNvPr id="1711248338" name=""/>
                     <pic:cNvPicPr/>
                   </pic:nvPicPr>
                   <pic:blipFill>
@@ -209,7 +187,7 @@
                   <pic:spPr>
                     <a:xfrm>
                       <a:off x="0" y="0"/>
-                      <a:ext cx="4479925" cy="3369945"/>
+                      <a:ext cx="4133741" cy="3398520"/>
                     </a:xfrm>
                     <a:prstGeom prst="rect">
                       <a:avLst/>
@@ -226,6 +204,12 @@
             </wp14:sizeRelV>
           </wp:anchor>
         </w:drawing>
+      </w:r>
+      <w:r>
+        <w:rPr>
+          <w:noProof/>
+        </w:rPr>
+        <w:t xml:space="preserve"> </w:t>
       </w:r>
     </w:p>
     <w:sectPr>

</xml_diff>